<commit_message>
feat(docx): complete document editing providers
</commit_message>
<xml_diff>
--- a/plugin/tests/fixtures/docx-malicious-absolute.docx
+++ b/plugin/tests/fixtures/docx-malicious-absolute.docx
@@ -37,6 +37,10 @@
       <w:tblPr>
         <w:tblStyle w:val="TableGrid"/>
       </w:tblPr>
+      <w:tblGrid>
+        <w:gridCol/>
+        <w:gridCol/>
+      </w:tblGrid>
       <w:tr>
         <w:tc>
           <w:p>

</xml_diff>

<commit_message>
feat(docx): complete document editing providers (#9)
</commit_message>
<xml_diff>
--- a/plugin/tests/fixtures/docx-malicious-absolute.docx
+++ b/plugin/tests/fixtures/docx-malicious-absolute.docx
@@ -37,6 +37,10 @@
       <w:tblPr>
         <w:tblStyle w:val="TableGrid"/>
       </w:tblPr>
+      <w:tblGrid>
+        <w:gridCol/>
+        <w:gridCol/>
+      </w:tblGrid>
       <w:tr>
         <w:tc>
           <w:p>

</xml_diff>

<commit_message>
feat(docx): add template packs and reference import
</commit_message>
<xml_diff>
--- a/plugin/tests/fixtures/docx-malicious-absolute.docx
+++ b/plugin/tests/fixtures/docx-malicious-absolute.docx
@@ -36,13 +36,18 @@
     <w:tbl>
       <w:tblPr>
         <w:tblStyle w:val="TableGrid"/>
+        <w:tblW w:w="9360" w:type="dxa"/>
+        <w:tblLayout w:type="fixed"/>
       </w:tblPr>
       <w:tblGrid>
-        <w:gridCol/>
-        <w:gridCol/>
+        <w:gridCol w:w="4680"/>
+        <w:gridCol w:w="4680"/>
       </w:tblGrid>
       <w:tr>
         <w:tc>
+          <w:tcPr>
+            <w:tcW w:w="4680" w:type="dxa"/>
+          </w:tcPr>
           <w:p>
             <w:r>
               <w:rPr>
@@ -53,6 +58,9 @@
           </w:p>
         </w:tc>
         <w:tc>
+          <w:tcPr>
+            <w:tcW w:w="4680" w:type="dxa"/>
+          </w:tcPr>
           <w:p>
             <w:r>
               <w:rPr>
@@ -65,6 +73,9 @@
       </w:tr>
       <w:tr>
         <w:tc>
+          <w:tcPr>
+            <w:tcW w:w="4680" w:type="dxa"/>
+          </w:tcPr>
           <w:p>
             <w:r>
               <w:t>Table</w:t>
@@ -72,6 +83,9 @@
           </w:p>
         </w:tc>
         <w:tc>
+          <w:tcPr>
+            <w:tcW w:w="4680" w:type="dxa"/>
+          </w:tcPr>
           <w:p>
             <w:r>
               <w:rPr>

</xml_diff>